<commit_message>
feat(ct01): in sẵn họ tên dưới chỗ ký của CT01 và hợp đồng ở nhờ
Chủ yêu cầu in ra chỉ còn ký tay. Mẫu CT01 (cả đăng ký lẫn hủy tạm trú)
thêm hàng tên dưới bốn cột ký: chủ hộ, chủ sở hữu chỗ ở, người kê khai;
cột cha mẹ/người giám hộ để trống vì chỉ dành cho người chưa thành niên.
Hợp đồng cho thuê, mượn, ở nhờ in tên bên A/bên B dưới "(ký và ghi rõ họ
tên)". Biên bản thanh lý đã có tên từ trước.

Chỉ đổi mẫu Word, dùng lại các trường household_head_name, owner_name,
full_name đã có. build-ct01-template.py sinh lại ct01.docx (bản cũ sinh
lại khớp từng phần) và chép nguyên phần CT01 sang ct01-huy.docx.

Kiểm: vitest ct01Document/ct01HuyDocument/ct01RoomBundle/docxMerge 49/49;
đặt lại mẫu cũ thì test mới đỏ. Điền dữ liệu thật vào hai mẫu, mở bằng
Word: vẫn 2 trang, tên đúng cột. gate:truoc-push 41/42, suite:node-native
đỏ 3 test chập chờn; chạy lại 24 file của suite đều xanh.

Co-Authored-By: Claude <noreply@anthropic.com>
</commit_message>
<xml_diff>
--- a/public/templates/ct01-huy.docx
+++ b/public/templates/ct01-huy.docx
@@ -3519,8 +3519,84 @@
           </w:p>
         </w:tc>
         <w:trPr>
-          <w:trHeight w:val="1400" w:hRule="atLeast"/>
+          <w:trHeight w:val="2600" w:hRule="atLeast"/>
         </w:trPr>
+      </w:tr>
+      <w:tr>
+        <w:tc>
+          <w:tcPr>
+            <w:tcW w:w="1344" w:type="pct"/>
+          </w:tcPr>
+          <w:p>
+            <w:pPr>
+              <w:spacing w:after="0" w:line="240" w:lineRule="auto"/>
+              <w:jc w:val="center"/>
+            </w:pPr>
+            <w:r>
+              <w:rPr>
+                <w:rFonts w:ascii="Times New Roman" w:eastAsia="Times New Roman" w:hAnsi="Times New Roman"/>
+                <w:b/>
+                <w:sz w:val="24"/>
+                <w:szCs w:val="24"/>
+                <w:lang w:val="vi-VN"/>
+              </w:rPr>
+              <w:t>{household_head_name}</w:t>
+            </w:r>
+          </w:p>
+        </w:tc>
+        <w:tc>
+          <w:tcPr>
+            <w:tcW w:w="1259" w:type="pct"/>
+          </w:tcPr>
+          <w:p>
+            <w:pPr>
+              <w:spacing w:after="0" w:line="240" w:lineRule="auto"/>
+              <w:jc w:val="center"/>
+            </w:pPr>
+            <w:r>
+              <w:rPr>
+                <w:rFonts w:ascii="Times New Roman" w:eastAsia="Times New Roman" w:hAnsi="Times New Roman"/>
+                <w:b/>
+                <w:sz w:val="24"/>
+                <w:szCs w:val="24"/>
+                <w:lang w:val="vi-VN"/>
+              </w:rPr>
+              <w:t>{owner_name}</w:t>
+            </w:r>
+          </w:p>
+        </w:tc>
+        <w:tc>
+          <w:tcPr>
+            <w:tcW w:w="1240" w:type="pct"/>
+          </w:tcPr>
+          <w:p>
+            <w:pPr>
+              <w:spacing w:after="0" w:line="240" w:lineRule="auto"/>
+              <w:jc w:val="center"/>
+            </w:pPr>
+          </w:p>
+        </w:tc>
+        <w:tc>
+          <w:tcPr>
+            <w:tcW w:w="1157" w:type="pct"/>
+          </w:tcPr>
+          <w:p>
+            <w:pPr>
+              <w:spacing w:after="0" w:line="240" w:lineRule="auto"/>
+              <w:jc w:val="center"/>
+            </w:pPr>
+            <w:r>
+              <w:rPr>
+                <w:rFonts w:ascii="Times New Roman" w:eastAsia="Times New Roman" w:hAnsi="Times New Roman"/>
+                <w:b/>
+                <w:sz w:val="24"/>
+                <w:szCs w:val="24"/>
+                <w:lang w:val="vi-VN"/>
+              </w:rPr>
+              <w:t>{full_name}</w:t>
+            </w:r>
+          </w:p>
+        </w:tc>
       </w:tr>
     </w:tbl>
     <w:p>

</xml_diff>